<commit_message>
Refactor EventBus: SelectionManager + 4 services + 3 emisores (Fase 2)
- js/core/eventBus.js (nuevo): singleton pub/sub on/off/emit
- js/ui/selectionManager.js: emite 'selection:changed' / 'selection:cleared' via EventBus
- js/service/highlightService.js: suscribe a EventBus, initialize propio
- js/service/navigationService.js: suscribe a EventBus, initialize propio
- js/service/synchronizationService.js: suscribe a EventBus, initialize propio
- js/service/historyService.js: suscribe a EventBus, initialize propio
- js/modules/svg/composerEvents.js: emite 'selection:requested' via EventBus
- js/ui/bom.js: emite 'selection:requested' via EventBus
- js/modules/svg/composerAdapter.js: emite 'selection:clear-requested' via EventBus
- js/core/engine.js: importa e inicializa 4 services antes de SelectionManager
</commit_message>
<xml_diff>
--- a/CLAUDE.docx
+++ b/CLAUDE.docx
@@ -4,192 +4,326 @@
   <w:body>
     <w:p>
       <w:r>
-        <w:t xml:space="preserve">intente subir el .zip pero me dice que no acepta este tipo de archivos, que otra </w:t>
+        <w:t xml:space="preserve">acabo de compartirte en la </w:t>
       </w:r>
       <w:proofErr w:type="spellStart"/>
       <w:r>
-        <w:t>opcion</w:t>
+        <w:t>seccion</w:t>
       </w:r>
       <w:proofErr w:type="spellEnd"/>
       <w:r>
-        <w:t xml:space="preserve"> tengo, </w:t>
+        <w:t xml:space="preserve"> de contexto GRAPH_REPORT y </w:t>
       </w:r>
       <w:proofErr w:type="spellStart"/>
       <w:r>
-        <w:t>podria</w:t>
+        <w:t>graph</w:t>
       </w:r>
       <w:proofErr w:type="spellEnd"/>
       <w:r>
-        <w:t xml:space="preserve"> subirle archivo por archivo y compartirle un archivo con la arquitectura exacta de mi carpeta madre o que mejor </w:t>
+        <w:t xml:space="preserve"> actualizados, </w:t>
       </w:r>
       <w:proofErr w:type="spellStart"/>
       <w:r>
-        <w:t>opcion</w:t>
+        <w:t>analizalos</w:t>
       </w:r>
       <w:proofErr w:type="spellEnd"/>
       <w:r>
-        <w:t xml:space="preserve"> puedes plantear</w:t>
-      </w:r>
-    </w:p>
-    <w:p/>
-    <w:p/>
-    <w:p>
-      <w:r>
-        <w:t>Hola. Vengo de una conversación anterior muy larga que tuve que cerrar por límite de mensajes. Te comparto RESUMEN_PROYECTO_SDTD.md con el estado completo y consolidado del proyecto — arquitectura de carpetas, responsabilidad de cada archivo, hallazgos técnicos importantes, y la lista de pendientes. Trátalo como la fuente de verdad.</w:t>
+        <w:t xml:space="preserve"> detalladamente y dame conclusiones </w:t>
       </w:r>
     </w:p>
     <w:p>
-      <w:r>
-        <w:t xml:space="preserve">También te subí los archivos reales actuales del proyecto (index.html, </w:t>
-      </w:r>
       <w:proofErr w:type="spellStart"/>
       <w:r>
-        <w:t>css</w:t>
+        <w:t>ademas</w:t>
       </w:r>
       <w:proofErr w:type="spellEnd"/>
       <w:r>
-        <w:t>/style.css, los .</w:t>
-      </w:r>
-      <w:proofErr w:type="spellStart"/>
-      <w:r>
-        <w:t>js</w:t>
-      </w:r>
-      <w:proofErr w:type="spellEnd"/>
-      <w:r>
-        <w:t xml:space="preserve"> de </w:t>
-      </w:r>
-      <w:proofErr w:type="spellStart"/>
-      <w:r>
-        <w:t>js</w:t>
-      </w:r>
-      <w:proofErr w:type="spellEnd"/>
-      <w:r>
-        <w:t xml:space="preserve">/core, </w:t>
-      </w:r>
-      <w:proofErr w:type="spellStart"/>
-      <w:r>
-        <w:t>js</w:t>
-      </w:r>
-      <w:proofErr w:type="spellEnd"/>
-      <w:r>
-        <w:t>/</w:t>
-      </w:r>
-      <w:proofErr w:type="spellStart"/>
-      <w:r>
-        <w:t>service</w:t>
-      </w:r>
-      <w:proofErr w:type="spellEnd"/>
-      <w:r>
-        <w:t xml:space="preserve">, </w:t>
-      </w:r>
-      <w:proofErr w:type="spellStart"/>
-      <w:r>
-        <w:t>js</w:t>
-      </w:r>
-      <w:proofErr w:type="spellEnd"/>
-      <w:r>
-        <w:t>/</w:t>
-      </w:r>
-      <w:proofErr w:type="spellStart"/>
-      <w:r>
-        <w:t>ui</w:t>
-      </w:r>
-      <w:proofErr w:type="spellEnd"/>
-      <w:r>
-        <w:t xml:space="preserve">, </w:t>
-      </w:r>
-      <w:proofErr w:type="spellStart"/>
-      <w:r>
-        <w:t>js</w:t>
-      </w:r>
-      <w:proofErr w:type="spellEnd"/>
-      <w:r>
-        <w:t>/modules/</w:t>
-      </w:r>
-      <w:proofErr w:type="spellStart"/>
-      <w:r>
-        <w:t>svg</w:t>
-      </w:r>
-      <w:proofErr w:type="spellEnd"/>
-      <w:r>
-        <w:t>, los data/*.</w:t>
-      </w:r>
-      <w:proofErr w:type="spellStart"/>
-      <w:r>
-        <w:t>json</w:t>
-      </w:r>
-      <w:proofErr w:type="spellEnd"/>
-      <w:r>
-        <w:t>, y pipeline/).</w:t>
+        <w:t xml:space="preserve"> te comparto lo siguiente:</w:t>
       </w:r>
     </w:p>
     <w:p>
-      <w:r>
-        <w:t>Antes de hacer cualquier cambio, quiero que:</w:t>
+      <w:pPr>
+        <w:rPr>
+          <w:lang w:val="en-US"/>
+        </w:rPr>
+      </w:pPr>
+      <w:r>
+        <w:rPr>
+          <w:lang w:val="en-US"/>
+        </w:rPr>
+        <w:t>Diff: 21 new nodes, 134 new edges, 2 nodes removed, 6 edges removed Final: 135 nodes, 240 edges, 21 communities</w:t>
       </w:r>
     </w:p>
     <w:p>
+      <w:r>
+        <w:t>God Nodes</w:t>
+      </w:r>
+    </w:p>
+    <w:p>
       <w:pPr>
         <w:numPr>
           <w:ilvl w:val="0"/>
-          <w:numId w:val="1"/>
+          <w:numId w:val="2"/>
         </w:numPr>
       </w:pPr>
       <w:r>
-        <w:t>Revises los archivos reales y confirmes que coinciden con lo que describe el resumen (en la conversación anterior hubo un caso donde mi copia real y la del asistente se desincronizaron, así que prefiero partir de una auditoría en vez de asumir que todo está alineado).</w:t>
-      </w:r>
+        <w:t xml:space="preserve">SDTD - 11 </w:t>
+      </w:r>
+      <w:proofErr w:type="spellStart"/>
+      <w:r>
+        <w:t>edges</w:t>
+      </w:r>
+      <w:proofErr w:type="spellEnd"/>
     </w:p>
     <w:p>
       <w:pPr>
         <w:numPr>
           <w:ilvl w:val="0"/>
-          <w:numId w:val="1"/>
+          <w:numId w:val="2"/>
         </w:numPr>
       </w:pPr>
       <w:r>
-        <w:t>Me digas si encuentras alguna diferencia entre lo que dice el resumen y lo que realmente hay en los archivos.</w:t>
-      </w:r>
+        <w:t xml:space="preserve">Plan de Integración Visor 3D ↔ SDTD - 11 </w:t>
+      </w:r>
+      <w:proofErr w:type="spellStart"/>
+      <w:r>
+        <w:t>edges</w:t>
+      </w:r>
+      <w:proofErr w:type="spellEnd"/>
     </w:p>
     <w:p>
-      <w:r>
-        <w:t xml:space="preserve">Mi prioridad inmediata es terminar la integración del visor 3D (sección 6.5 del resumen) — quiero presentarle el proyecto a mi cliente pronto. El punto exacto donde quedamos fue: ubicar (pero no aún modificar) la línea </w:t>
-      </w:r>
-      <w:proofErr w:type="spellStart"/>
-      <w:r>
-        <w:t>onInit</w:t>
-      </w:r>
-      <w:proofErr w:type="spellEnd"/>
-      <w:r>
-        <w:t xml:space="preserve"> = </w:t>
-      </w:r>
-      <w:proofErr w:type="spellStart"/>
-      <w:r>
-        <w:t>function</w:t>
-      </w:r>
-      <w:proofErr w:type="spellEnd"/>
-      <w:r>
-        <w:t>(</w:t>
-      </w:r>
-      <w:proofErr w:type="spellStart"/>
-      <w:r>
-        <w:t>iViewer</w:t>
-      </w:r>
-      <w:proofErr w:type="spellEnd"/>
-      <w:r>
-        <w:t xml:space="preserve">){...} dentro de </w:t>
-      </w:r>
-      <w:proofErr w:type="spellStart"/>
-      <w:r>
-        <w:t>resources</w:t>
-      </w:r>
-      <w:proofErr w:type="spellEnd"/>
-      <w:r>
-        <w:t>/3d/ER5215-301.html, para inyectar ahí una línea que exponga la instancia del visor 3D a una variable global y así poder controlarlo desde nuestra app (selección, zoom, centrado, vínculo con el BOM).</w:t>
+      <w:pPr>
+        <w:numPr>
+          <w:ilvl w:val="0"/>
+          <w:numId w:val="2"/>
+        </w:numPr>
+        <w:rPr>
+          <w:lang w:val="en-US"/>
+        </w:rPr>
+      </w:pPr>
+      <w:r>
+        <w:rPr>
+          <w:lang w:val="en-US"/>
+        </w:rPr>
+        <w:t>Technical Findings and Open Problems - 9 edges</w:t>
       </w:r>
     </w:p>
     <w:p>
-      <w:r>
-        <w:t>Trabajemos paso a paso, con archivos completos para pegar (no solo fragmentos), y confírmame que entendiste antes de escribir código.</w:t>
+      <w:pPr>
+        <w:numPr>
+          <w:ilvl w:val="0"/>
+          <w:numId w:val="2"/>
+        </w:numPr>
+      </w:pPr>
+      <w:r>
+        <w:t xml:space="preserve">Bill </w:t>
+      </w:r>
+      <w:proofErr w:type="spellStart"/>
+      <w:r>
+        <w:t>of</w:t>
+      </w:r>
+      <w:proofErr w:type="spellEnd"/>
+      <w:r>
+        <w:t xml:space="preserve"> </w:t>
+      </w:r>
+      <w:proofErr w:type="spellStart"/>
+      <w:r>
+        <w:t>Materials</w:t>
+      </w:r>
+      <w:proofErr w:type="spellEnd"/>
+      <w:r>
+        <w:t xml:space="preserve"> (BOM) - 9 </w:t>
+      </w:r>
+      <w:proofErr w:type="spellStart"/>
+      <w:r>
+        <w:t>edges</w:t>
+      </w:r>
+      <w:proofErr w:type="spellEnd"/>
+    </w:p>
+    <w:p>
+      <w:pPr>
+        <w:numPr>
+          <w:ilvl w:val="0"/>
+          <w:numId w:val="2"/>
+        </w:numPr>
+        <w:rPr>
+          <w:lang w:val="en-US"/>
+        </w:rPr>
+      </w:pPr>
+      <w:r>
+        <w:rPr>
+          <w:lang w:val="en-US"/>
+        </w:rPr>
+        <w:t>ER5215-301 Pilot Project (RAD Equipement) - 8 edges</w:t>
+      </w:r>
+    </w:p>
+    <w:p>
+      <w:proofErr w:type="spellStart"/>
+      <w:r>
+        <w:t>Surprising</w:t>
+      </w:r>
+      <w:proofErr w:type="spellEnd"/>
+      <w:r>
+        <w:t xml:space="preserve"> </w:t>
+      </w:r>
+      <w:proofErr w:type="spellStart"/>
+      <w:r>
+        <w:t>Connections</w:t>
+      </w:r>
+      <w:proofErr w:type="spellEnd"/>
+    </w:p>
+    <w:p>
+      <w:pPr>
+        <w:numPr>
+          <w:ilvl w:val="0"/>
+          <w:numId w:val="3"/>
+        </w:numPr>
+        <w:rPr>
+          <w:lang w:val="en-US"/>
+        </w:rPr>
+      </w:pPr>
+      <w:r>
+        <w:rPr>
+          <w:lang w:val="en-US"/>
+        </w:rPr>
+        <w:t>ER5215-301 Assembly Diagram Image → ER5215-301 Pilot Project [INFERRED]</w:t>
+      </w:r>
+    </w:p>
+    <w:p>
+      <w:pPr>
+        <w:numPr>
+          <w:ilvl w:val="0"/>
+          <w:numId w:val="3"/>
+        </w:numPr>
+        <w:rPr>
+          <w:lang w:val="en-US"/>
+        </w:rPr>
+      </w:pPr>
+      <w:r>
+        <w:rPr>
+          <w:lang w:val="en-US"/>
+        </w:rPr>
+        <w:t>BOM Checkbox Multi-select → Composer SVG Hotspot Mechanism [EXTRACTED]</w:t>
+      </w:r>
+    </w:p>
+    <w:p>
+      <w:pPr>
+        <w:numPr>
+          <w:ilvl w:val="0"/>
+          <w:numId w:val="3"/>
+        </w:numPr>
+      </w:pPr>
+      <w:proofErr w:type="spellStart"/>
+      <w:r>
+        <w:t>Actions</w:t>
+      </w:r>
+      <w:proofErr w:type="spellEnd"/>
+      <w:r>
+        <w:t xml:space="preserve"> Panel </w:t>
+      </w:r>
+      <w:proofErr w:type="spellStart"/>
+      <w:r>
+        <w:t>mailto</w:t>
+      </w:r>
+      <w:proofErr w:type="spellEnd"/>
+      <w:r>
+        <w:t xml:space="preserve"> → RAD </w:t>
+      </w:r>
+      <w:proofErr w:type="spellStart"/>
+      <w:r>
+        <w:t>Equipement</w:t>
+      </w:r>
+      <w:proofErr w:type="spellEnd"/>
+      <w:r>
+        <w:t xml:space="preserve"> Client Logo [INFERRED]</w:t>
+      </w:r>
+    </w:p>
+    <w:p>
+      <w:proofErr w:type="spellStart"/>
+      <w:r>
+        <w:t>Suggested</w:t>
+      </w:r>
+      <w:proofErr w:type="spellEnd"/>
+      <w:r>
+        <w:t xml:space="preserve"> Questions</w:t>
+      </w:r>
+    </w:p>
+    <w:p>
+      <w:pPr>
+        <w:numPr>
+          <w:ilvl w:val="0"/>
+          <w:numId w:val="4"/>
+        </w:numPr>
+        <w:rPr>
+          <w:lang w:val="en-US"/>
+        </w:rPr>
+      </w:pPr>
+      <w:r>
+        <w:rPr>
+          <w:lang w:val="en-US"/>
+        </w:rPr>
+        <w:t>Why does BOM connect CAD/BOM Knowledge Base to 3D Viewer Integration? — high betweenness centrality</w:t>
+      </w:r>
+    </w:p>
+    <w:p>
+      <w:pPr>
+        <w:numPr>
+          <w:ilvl w:val="0"/>
+          <w:numId w:val="4"/>
+        </w:numPr>
+        <w:rPr>
+          <w:lang w:val="en-US"/>
+        </w:rPr>
+      </w:pPr>
+      <w:r>
+        <w:rPr>
+          <w:lang w:val="en-US"/>
+        </w:rPr>
+        <w:t>What connects the 24 isolated analyzer nodes to the rest of the system? — possible documentation gaps</w:t>
+      </w:r>
+    </w:p>
+    <w:p>
+      <w:pPr>
+        <w:numPr>
+          <w:ilvl w:val="0"/>
+          <w:numId w:val="4"/>
+        </w:numPr>
+        <w:rPr>
+          <w:lang w:val="en-US"/>
+        </w:rPr>
+      </w:pPr>
+      <w:r>
+        <w:rPr>
+          <w:lang w:val="en-US"/>
+        </w:rPr>
+        <w:t>Should CAD/BOM Knowledge Base (cohesion 0.13) be split into smaller modules?</w:t>
+      </w:r>
+    </w:p>
+    <w:p>
+      <w:r>
+        <w:rPr>
+          <w:lang w:val="en-US"/>
+        </w:rPr>
+        <w:t xml:space="preserve">The most interesting question this graph can answer: Why does Bill of Materials (BOM) connect CAD/BOM Knowledge Base to 3D Viewer Integration? </w:t>
+      </w:r>
+      <w:r>
+        <w:t xml:space="preserve">Want me </w:t>
+      </w:r>
+      <w:proofErr w:type="spellStart"/>
+      <w:r>
+        <w:t>to</w:t>
+      </w:r>
+      <w:proofErr w:type="spellEnd"/>
+      <w:r>
+        <w:t xml:space="preserve"> trace </w:t>
+      </w:r>
+      <w:proofErr w:type="spellStart"/>
+      <w:r>
+        <w:t>it</w:t>
+      </w:r>
+      <w:proofErr w:type="spellEnd"/>
+      <w:r>
+        <w:t>?</w:t>
       </w:r>
     </w:p>
     <w:p/>
@@ -206,6 +340,155 @@
 <file path=word/numbering.xml><?xml version="1.0" encoding="utf-8"?>
 <w:numbering xmlns:wpc="http://schemas.microsoft.com/office/word/2010/wordprocessingCanvas" xmlns:cx="http://schemas.microsoft.com/office/drawing/2014/chartex" xmlns:cx1="http://schemas.microsoft.com/office/drawing/2015/9/8/chartex" xmlns:cx2="http://schemas.microsoft.com/office/drawing/2015/10/21/chartex" xmlns:cx3="http://schemas.microsoft.com/office/drawing/2016/5/9/chartex" xmlns:cx4="http://schemas.microsoft.com/office/drawing/2016/5/10/chartex" xmlns:cx5="http://schemas.microsoft.com/office/drawing/2016/5/11/chartex" xmlns:cx6="http://schemas.microsoft.com/office/drawing/2016/5/12/chartex" xmlns:cx7="http://schemas.microsoft.com/office/drawing/2016/5/13/chartex" xmlns:cx8="http://schemas.microsoft.com/office/drawing/2016/5/14/chartex" xmlns:mc="http://schemas.openxmlformats.org/markup-compatibility/2006" xmlns:aink="http://schemas.microsoft.com/office/drawing/2016/ink" xmlns:am3d="http://schemas.microsoft.com/office/drawing/2017/model3d" xmlns:o="urn:schemas-microsoft-com:office:office" xmlns:oel="http://schemas.microsoft.com/office/2019/extlst" xmlns:r="http://schemas.openxmlformats.org/officeDocument/2006/relationships" xmlns:m="http://schemas.openxmlformats.org/officeDocument/2006/math" xmlns:v="urn:schemas-microsoft-com:vml" xmlns:wp14="http://schemas.microsoft.com/office/word/2010/wordprocessingDrawing" xmlns:wp="http://schemas.openxmlformats.org/drawingml/2006/wordprocessingDrawing" xmlns:w10="urn:schemas-microsoft-com:office:word" xmlns:w="http://schemas.openxmlformats.org/wordprocessingml/2006/main" xmlns:w14="http://schemas.microsoft.com/office/word/2010/wordml" xmlns:w15="http://schemas.microsoft.com/office/word/2012/wordml" xmlns:w16cex="http://schemas.microsoft.com/office/word/2018/wordml/cex" xmlns:w16cid="http://schemas.microsoft.com/office/word/2016/wordml/cid" xmlns:w16="http://schemas.microsoft.com/office/word/2018/wordml" xmlns:w16du="http://schemas.microsoft.com/office/word/2023/wordml/word16du" xmlns:w16sdtdh="http://schemas.microsoft.com/office/word/2020/wordml/sdtdatahash" xmlns:w16sdtfl="http://schemas.microsoft.com/office/word/2024/wordml/sdtformatlock" xmlns:w16se="http://schemas.microsoft.com/office/word/2015/wordml/symex" xmlns:wpg="http://schemas.microsoft.com/office/word/2010/wordprocessingGroup" xmlns:wpi="http://schemas.microsoft.com/office/word/2010/wordprocessingInk" xmlns:wne="http://schemas.microsoft.com/office/word/2006/wordml" xmlns:wps="http://schemas.microsoft.com/office/word/2010/wordprocessingShape" mc:Ignorable="w14 w15 w16se w16cid w16 w16cex w16sdtdh w16sdtfl w16du wp14">
   <w:abstractNum w:abstractNumId="0" w15:restartNumberingAfterBreak="0">
+    <w:nsid w:val="1B024D21"/>
+    <w:multiLevelType w:val="multilevel"/>
+    <w:tmpl w:val="65FAA670"/>
+    <w:lvl w:ilvl="0">
+      <w:start w:val="1"/>
+      <w:numFmt w:val="bullet"/>
+      <w:lvlText w:val=""/>
+      <w:lvlJc w:val="left"/>
+      <w:pPr>
+        <w:tabs>
+          <w:tab w:val="num" w:pos="720"/>
+        </w:tabs>
+        <w:ind w:left="720" w:hanging="360"/>
+      </w:pPr>
+      <w:rPr>
+        <w:rFonts w:ascii="Symbol" w:hAnsi="Symbol" w:hint="default"/>
+        <w:sz w:val="20"/>
+      </w:rPr>
+    </w:lvl>
+    <w:lvl w:ilvl="1" w:tentative="1">
+      <w:start w:val="1"/>
+      <w:numFmt w:val="bullet"/>
+      <w:lvlText w:val="o"/>
+      <w:lvlJc w:val="left"/>
+      <w:pPr>
+        <w:tabs>
+          <w:tab w:val="num" w:pos="1440"/>
+        </w:tabs>
+        <w:ind w:left="1440" w:hanging="360"/>
+      </w:pPr>
+      <w:rPr>
+        <w:rFonts w:ascii="Courier New" w:hAnsi="Courier New" w:hint="default"/>
+        <w:sz w:val="20"/>
+      </w:rPr>
+    </w:lvl>
+    <w:lvl w:ilvl="2" w:tentative="1">
+      <w:start w:val="1"/>
+      <w:numFmt w:val="bullet"/>
+      <w:lvlText w:val=""/>
+      <w:lvlJc w:val="left"/>
+      <w:pPr>
+        <w:tabs>
+          <w:tab w:val="num" w:pos="2160"/>
+        </w:tabs>
+        <w:ind w:left="2160" w:hanging="360"/>
+      </w:pPr>
+      <w:rPr>
+        <w:rFonts w:ascii="Wingdings" w:hAnsi="Wingdings" w:hint="default"/>
+        <w:sz w:val="20"/>
+      </w:rPr>
+    </w:lvl>
+    <w:lvl w:ilvl="3" w:tentative="1">
+      <w:start w:val="1"/>
+      <w:numFmt w:val="bullet"/>
+      <w:lvlText w:val=""/>
+      <w:lvlJc w:val="left"/>
+      <w:pPr>
+        <w:tabs>
+          <w:tab w:val="num" w:pos="2880"/>
+        </w:tabs>
+        <w:ind w:left="2880" w:hanging="360"/>
+      </w:pPr>
+      <w:rPr>
+        <w:rFonts w:ascii="Wingdings" w:hAnsi="Wingdings" w:hint="default"/>
+        <w:sz w:val="20"/>
+      </w:rPr>
+    </w:lvl>
+    <w:lvl w:ilvl="4" w:tentative="1">
+      <w:start w:val="1"/>
+      <w:numFmt w:val="bullet"/>
+      <w:lvlText w:val=""/>
+      <w:lvlJc w:val="left"/>
+      <w:pPr>
+        <w:tabs>
+          <w:tab w:val="num" w:pos="3600"/>
+        </w:tabs>
+        <w:ind w:left="3600" w:hanging="360"/>
+      </w:pPr>
+      <w:rPr>
+        <w:rFonts w:ascii="Wingdings" w:hAnsi="Wingdings" w:hint="default"/>
+        <w:sz w:val="20"/>
+      </w:rPr>
+    </w:lvl>
+    <w:lvl w:ilvl="5" w:tentative="1">
+      <w:start w:val="1"/>
+      <w:numFmt w:val="bullet"/>
+      <w:lvlText w:val=""/>
+      <w:lvlJc w:val="left"/>
+      <w:pPr>
+        <w:tabs>
+          <w:tab w:val="num" w:pos="4320"/>
+        </w:tabs>
+        <w:ind w:left="4320" w:hanging="360"/>
+      </w:pPr>
+      <w:rPr>
+        <w:rFonts w:ascii="Wingdings" w:hAnsi="Wingdings" w:hint="default"/>
+        <w:sz w:val="20"/>
+      </w:rPr>
+    </w:lvl>
+    <w:lvl w:ilvl="6" w:tentative="1">
+      <w:start w:val="1"/>
+      <w:numFmt w:val="bullet"/>
+      <w:lvlText w:val=""/>
+      <w:lvlJc w:val="left"/>
+      <w:pPr>
+        <w:tabs>
+          <w:tab w:val="num" w:pos="5040"/>
+        </w:tabs>
+        <w:ind w:left="5040" w:hanging="360"/>
+      </w:pPr>
+      <w:rPr>
+        <w:rFonts w:ascii="Wingdings" w:hAnsi="Wingdings" w:hint="default"/>
+        <w:sz w:val="20"/>
+      </w:rPr>
+    </w:lvl>
+    <w:lvl w:ilvl="7" w:tentative="1">
+      <w:start w:val="1"/>
+      <w:numFmt w:val="bullet"/>
+      <w:lvlText w:val=""/>
+      <w:lvlJc w:val="left"/>
+      <w:pPr>
+        <w:tabs>
+          <w:tab w:val="num" w:pos="5760"/>
+        </w:tabs>
+        <w:ind w:left="5760" w:hanging="360"/>
+      </w:pPr>
+      <w:rPr>
+        <w:rFonts w:ascii="Wingdings" w:hAnsi="Wingdings" w:hint="default"/>
+        <w:sz w:val="20"/>
+      </w:rPr>
+    </w:lvl>
+    <w:lvl w:ilvl="8" w:tentative="1">
+      <w:start w:val="1"/>
+      <w:numFmt w:val="bullet"/>
+      <w:lvlText w:val=""/>
+      <w:lvlJc w:val="left"/>
+      <w:pPr>
+        <w:tabs>
+          <w:tab w:val="num" w:pos="6480"/>
+        </w:tabs>
+        <w:ind w:left="6480" w:hanging="360"/>
+      </w:pPr>
+      <w:rPr>
+        <w:rFonts w:ascii="Wingdings" w:hAnsi="Wingdings" w:hint="default"/>
+        <w:sz w:val="20"/>
+      </w:rPr>
+    </w:lvl>
+  </w:abstractNum>
+  <w:abstractNum w:abstractNumId="1" w15:restartNumberingAfterBreak="0">
     <w:nsid w:val="41AE667E"/>
     <w:multiLevelType w:val="multilevel"/>
     <w:tmpl w:val="72C4241C"/>
@@ -318,7 +601,278 @@
       </w:pPr>
     </w:lvl>
   </w:abstractNum>
+  <w:abstractNum w:abstractNumId="2" w15:restartNumberingAfterBreak="0">
+    <w:nsid w:val="64AB31A7"/>
+    <w:multiLevelType w:val="multilevel"/>
+    <w:tmpl w:val="176C12A2"/>
+    <w:lvl w:ilvl="0">
+      <w:start w:val="1"/>
+      <w:numFmt w:val="decimal"/>
+      <w:lvlText w:val="%1."/>
+      <w:lvlJc w:val="left"/>
+      <w:pPr>
+        <w:tabs>
+          <w:tab w:val="num" w:pos="720"/>
+        </w:tabs>
+        <w:ind w:left="720" w:hanging="360"/>
+      </w:pPr>
+    </w:lvl>
+    <w:lvl w:ilvl="1" w:tentative="1">
+      <w:start w:val="1"/>
+      <w:numFmt w:val="decimal"/>
+      <w:lvlText w:val="%2."/>
+      <w:lvlJc w:val="left"/>
+      <w:pPr>
+        <w:tabs>
+          <w:tab w:val="num" w:pos="1440"/>
+        </w:tabs>
+        <w:ind w:left="1440" w:hanging="360"/>
+      </w:pPr>
+    </w:lvl>
+    <w:lvl w:ilvl="2" w:tentative="1">
+      <w:start w:val="1"/>
+      <w:numFmt w:val="decimal"/>
+      <w:lvlText w:val="%3."/>
+      <w:lvlJc w:val="left"/>
+      <w:pPr>
+        <w:tabs>
+          <w:tab w:val="num" w:pos="2160"/>
+        </w:tabs>
+        <w:ind w:left="2160" w:hanging="360"/>
+      </w:pPr>
+    </w:lvl>
+    <w:lvl w:ilvl="3" w:tentative="1">
+      <w:start w:val="1"/>
+      <w:numFmt w:val="decimal"/>
+      <w:lvlText w:val="%4."/>
+      <w:lvlJc w:val="left"/>
+      <w:pPr>
+        <w:tabs>
+          <w:tab w:val="num" w:pos="2880"/>
+        </w:tabs>
+        <w:ind w:left="2880" w:hanging="360"/>
+      </w:pPr>
+    </w:lvl>
+    <w:lvl w:ilvl="4" w:tentative="1">
+      <w:start w:val="1"/>
+      <w:numFmt w:val="decimal"/>
+      <w:lvlText w:val="%5."/>
+      <w:lvlJc w:val="left"/>
+      <w:pPr>
+        <w:tabs>
+          <w:tab w:val="num" w:pos="3600"/>
+        </w:tabs>
+        <w:ind w:left="3600" w:hanging="360"/>
+      </w:pPr>
+    </w:lvl>
+    <w:lvl w:ilvl="5" w:tentative="1">
+      <w:start w:val="1"/>
+      <w:numFmt w:val="decimal"/>
+      <w:lvlText w:val="%6."/>
+      <w:lvlJc w:val="left"/>
+      <w:pPr>
+        <w:tabs>
+          <w:tab w:val="num" w:pos="4320"/>
+        </w:tabs>
+        <w:ind w:left="4320" w:hanging="360"/>
+      </w:pPr>
+    </w:lvl>
+    <w:lvl w:ilvl="6" w:tentative="1">
+      <w:start w:val="1"/>
+      <w:numFmt w:val="decimal"/>
+      <w:lvlText w:val="%7."/>
+      <w:lvlJc w:val="left"/>
+      <w:pPr>
+        <w:tabs>
+          <w:tab w:val="num" w:pos="5040"/>
+        </w:tabs>
+        <w:ind w:left="5040" w:hanging="360"/>
+      </w:pPr>
+    </w:lvl>
+    <w:lvl w:ilvl="7" w:tentative="1">
+      <w:start w:val="1"/>
+      <w:numFmt w:val="decimal"/>
+      <w:lvlText w:val="%8."/>
+      <w:lvlJc w:val="left"/>
+      <w:pPr>
+        <w:tabs>
+          <w:tab w:val="num" w:pos="5760"/>
+        </w:tabs>
+        <w:ind w:left="5760" w:hanging="360"/>
+      </w:pPr>
+    </w:lvl>
+    <w:lvl w:ilvl="8" w:tentative="1">
+      <w:start w:val="1"/>
+      <w:numFmt w:val="decimal"/>
+      <w:lvlText w:val="%9."/>
+      <w:lvlJc w:val="left"/>
+      <w:pPr>
+        <w:tabs>
+          <w:tab w:val="num" w:pos="6480"/>
+        </w:tabs>
+        <w:ind w:left="6480" w:hanging="360"/>
+      </w:pPr>
+    </w:lvl>
+  </w:abstractNum>
+  <w:abstractNum w:abstractNumId="3" w15:restartNumberingAfterBreak="0">
+    <w:nsid w:val="662C7999"/>
+    <w:multiLevelType w:val="multilevel"/>
+    <w:tmpl w:val="4DF64358"/>
+    <w:lvl w:ilvl="0">
+      <w:start w:val="1"/>
+      <w:numFmt w:val="bullet"/>
+      <w:lvlText w:val=""/>
+      <w:lvlJc w:val="left"/>
+      <w:pPr>
+        <w:tabs>
+          <w:tab w:val="num" w:pos="720"/>
+        </w:tabs>
+        <w:ind w:left="720" w:hanging="360"/>
+      </w:pPr>
+      <w:rPr>
+        <w:rFonts w:ascii="Symbol" w:hAnsi="Symbol" w:hint="default"/>
+        <w:sz w:val="20"/>
+      </w:rPr>
+    </w:lvl>
+    <w:lvl w:ilvl="1" w:tentative="1">
+      <w:start w:val="1"/>
+      <w:numFmt w:val="bullet"/>
+      <w:lvlText w:val="o"/>
+      <w:lvlJc w:val="left"/>
+      <w:pPr>
+        <w:tabs>
+          <w:tab w:val="num" w:pos="1440"/>
+        </w:tabs>
+        <w:ind w:left="1440" w:hanging="360"/>
+      </w:pPr>
+      <w:rPr>
+        <w:rFonts w:ascii="Courier New" w:hAnsi="Courier New" w:hint="default"/>
+        <w:sz w:val="20"/>
+      </w:rPr>
+    </w:lvl>
+    <w:lvl w:ilvl="2" w:tentative="1">
+      <w:start w:val="1"/>
+      <w:numFmt w:val="bullet"/>
+      <w:lvlText w:val=""/>
+      <w:lvlJc w:val="left"/>
+      <w:pPr>
+        <w:tabs>
+          <w:tab w:val="num" w:pos="2160"/>
+        </w:tabs>
+        <w:ind w:left="2160" w:hanging="360"/>
+      </w:pPr>
+      <w:rPr>
+        <w:rFonts w:ascii="Wingdings" w:hAnsi="Wingdings" w:hint="default"/>
+        <w:sz w:val="20"/>
+      </w:rPr>
+    </w:lvl>
+    <w:lvl w:ilvl="3" w:tentative="1">
+      <w:start w:val="1"/>
+      <w:numFmt w:val="bullet"/>
+      <w:lvlText w:val=""/>
+      <w:lvlJc w:val="left"/>
+      <w:pPr>
+        <w:tabs>
+          <w:tab w:val="num" w:pos="2880"/>
+        </w:tabs>
+        <w:ind w:left="2880" w:hanging="360"/>
+      </w:pPr>
+      <w:rPr>
+        <w:rFonts w:ascii="Wingdings" w:hAnsi="Wingdings" w:hint="default"/>
+        <w:sz w:val="20"/>
+      </w:rPr>
+    </w:lvl>
+    <w:lvl w:ilvl="4" w:tentative="1">
+      <w:start w:val="1"/>
+      <w:numFmt w:val="bullet"/>
+      <w:lvlText w:val=""/>
+      <w:lvlJc w:val="left"/>
+      <w:pPr>
+        <w:tabs>
+          <w:tab w:val="num" w:pos="3600"/>
+        </w:tabs>
+        <w:ind w:left="3600" w:hanging="360"/>
+      </w:pPr>
+      <w:rPr>
+        <w:rFonts w:ascii="Wingdings" w:hAnsi="Wingdings" w:hint="default"/>
+        <w:sz w:val="20"/>
+      </w:rPr>
+    </w:lvl>
+    <w:lvl w:ilvl="5" w:tentative="1">
+      <w:start w:val="1"/>
+      <w:numFmt w:val="bullet"/>
+      <w:lvlText w:val=""/>
+      <w:lvlJc w:val="left"/>
+      <w:pPr>
+        <w:tabs>
+          <w:tab w:val="num" w:pos="4320"/>
+        </w:tabs>
+        <w:ind w:left="4320" w:hanging="360"/>
+      </w:pPr>
+      <w:rPr>
+        <w:rFonts w:ascii="Wingdings" w:hAnsi="Wingdings" w:hint="default"/>
+        <w:sz w:val="20"/>
+      </w:rPr>
+    </w:lvl>
+    <w:lvl w:ilvl="6" w:tentative="1">
+      <w:start w:val="1"/>
+      <w:numFmt w:val="bullet"/>
+      <w:lvlText w:val=""/>
+      <w:lvlJc w:val="left"/>
+      <w:pPr>
+        <w:tabs>
+          <w:tab w:val="num" w:pos="5040"/>
+        </w:tabs>
+        <w:ind w:left="5040" w:hanging="360"/>
+      </w:pPr>
+      <w:rPr>
+        <w:rFonts w:ascii="Wingdings" w:hAnsi="Wingdings" w:hint="default"/>
+        <w:sz w:val="20"/>
+      </w:rPr>
+    </w:lvl>
+    <w:lvl w:ilvl="7" w:tentative="1">
+      <w:start w:val="1"/>
+      <w:numFmt w:val="bullet"/>
+      <w:lvlText w:val=""/>
+      <w:lvlJc w:val="left"/>
+      <w:pPr>
+        <w:tabs>
+          <w:tab w:val="num" w:pos="5760"/>
+        </w:tabs>
+        <w:ind w:left="5760" w:hanging="360"/>
+      </w:pPr>
+      <w:rPr>
+        <w:rFonts w:ascii="Wingdings" w:hAnsi="Wingdings" w:hint="default"/>
+        <w:sz w:val="20"/>
+      </w:rPr>
+    </w:lvl>
+    <w:lvl w:ilvl="8" w:tentative="1">
+      <w:start w:val="1"/>
+      <w:numFmt w:val="bullet"/>
+      <w:lvlText w:val=""/>
+      <w:lvlJc w:val="left"/>
+      <w:pPr>
+        <w:tabs>
+          <w:tab w:val="num" w:pos="6480"/>
+        </w:tabs>
+        <w:ind w:left="6480" w:hanging="360"/>
+      </w:pPr>
+      <w:rPr>
+        <w:rFonts w:ascii="Wingdings" w:hAnsi="Wingdings" w:hint="default"/>
+        <w:sz w:val="20"/>
+      </w:rPr>
+    </w:lvl>
+  </w:abstractNum>
   <w:num w:numId="1" w16cid:durableId="1458641752">
+    <w:abstractNumId w:val="1"/>
+  </w:num>
+  <w:num w:numId="2" w16cid:durableId="492259355">
+    <w:abstractNumId w:val="2"/>
+  </w:num>
+  <w:num w:numId="3" w16cid:durableId="222562644">
+    <w:abstractNumId w:val="3"/>
+  </w:num>
+  <w:num w:numId="4" w16cid:durableId="1338118887">
     <w:abstractNumId w:val="0"/>
   </w:num>
 </w:numbering>

</xml_diff>